<commit_message>
Align agreement templates and privacy policy with the system
Templates: technical data (last sign-in use, IP in server logs) and
Google Calendar event IDs among user data; employee agreement no longer
claims no activity is recorded; export described as prepared by the
provider (no self-service export); backup details left to confirm with
the hosting provider. Policy (PL/EN): Google Calendar event IDs listed
among account data, last-updated date.

Co-Authored-By: Claude Opus 5.5 <noreply@anthropic.com>
Claude-Session: https://claude.ai/code/session_012bWKm9LT7nz99hkDemzfRU
</commit_message>
<xml_diff>
--- a/docs/umowy/GastroFlowx-porozumienie-z-pracownikiem.docx
+++ b/docs/umowy/GastroFlowx-porozumienie-z-pracownikiem.docx
@@ -634,7 +634,7 @@
         <w:jc w:val="both"/>
       </w:pPr>
       <w:r>
-        <w:t xml:space="preserve">W związku z korzystaniem z Systemu Pracodawca przetwarza następujące dane Pracownika: imię i nazwisko, służbowy adres e-mail, rolę, informację o przydziale licencji, preferencje (np. język, domyślne godziny przypomnień) oraz informacje o autorstwie wpisów, przypisanych zadaniach i udostępnieniach.</w:t>
+        <w:t xml:space="preserve">W związku z korzystaniem z Systemu Pracodawca przetwarza następujące dane Pracownika: imię i nazwisko, służbowy adres e-mail, rolę, informację o przydziale licencji, preferencje (np. język, domyślne godziny przypomnień), informacje o autorstwie wpisów, przypisanych zadaniach i udostępnieniach, identyfikatory wydarzeń w Kalendarzu Google (jeżeli Pracownik włączy synchronizację) oraz dane techniczne: datę ostatniego użycia logowania i adres IP w dziennikach serwera, przechowywanych do 14 dni w celach bezpieczeństwa.</w:t>
       </w:r>
     </w:p>
     <w:p>
@@ -702,7 +702,7 @@
         <w:jc w:val="both"/>
       </w:pPr>
       <w:r>
-        <w:t xml:space="preserve">nie rejestruje czasu pracy, aktywności przeglądarki ani położenia Pracownika.</w:t>
+        <w:t xml:space="preserve">nie rejestruje czasu pracy ani położenia Pracownika i nie analizuje jego aktywności – daty wpisów i dane techniczne z ust. 1 służą wyłącznie działaniu Systemu i jego bezpieczeństwu.</w:t>
       </w:r>
     </w:p>
     <w:p>

</xml_diff>